<commit_message>
Actualizar documentacion APA con arquitectura API Gateway en cloud.
Co-authored-by: Cursor <cursoragent@cursor.com>
</commit_message>
<xml_diff>
--- a/docs/Documentacion_BankAccountApplication_APA.docx
+++ b/docs/Documentacion_BankAccountApplication_APA.docx
@@ -796,7 +796,128 @@
           <w:i w:val="0"/>
           <w:sz w:val="24"/>
         </w:rPr>
-        <w:t>Para el punto extra de despliegue, se implementó contenedorización con Docker multi-stage, reduciendo el tamaño de las imágenes finales. Docker Compose orquesta tres servicios: PostgreSQL, backend Spring Boot y frontend Nginx. Nginx actúa como reverse proxy, redirigiendo las peticiones /accounts hacia el microservicio. Se documentó un pipeline CI/CD propuesto y una arquitectura cloud en AWS (ALB + ECS + RDS).</w:t>
+        <w:t>Para el punto extra de despliegue, se implementó contenedorización con Docker multi-stage, reduciendo el tamaño de las imágenes finales. Docker Compose orquesta tres servicios: PostgreSQL, backend Spring Boot y frontend Nginx. Nginx actúa como reverse proxy, redirigiendo las peticiones /accounts hacia el microservicio. Se documentó un pipeline CI/CD propuesto y una arquitectura cloud en AWS.</w:t>
+      </w:r>
+    </w:p>
+    <w:p>
+      <w:pPr>
+        <w:pStyle w:val="Heading3"/>
+        <w:spacing w:line="480" w:lineRule="auto" w:before="0" w:after="0"/>
+        <w:jc w:val="left"/>
+      </w:pPr>
+      <w:r>
+        <w:rPr>
+          <w:rFonts w:ascii="Times New Roman" w:hAnsi="Times New Roman" w:eastAsia="Times New Roman"/>
+          <w:b/>
+          <w:i/>
+          <w:sz w:val="24"/>
+        </w:rPr>
+        <w:t>Arquitectura Cloud con API Gateway</w:t>
+      </w:r>
+    </w:p>
+    <w:p>
+      <w:pPr>
+        <w:spacing w:line="480" w:lineRule="auto" w:after="0" w:before="0"/>
+        <w:jc w:val="both"/>
+      </w:pPr>
+      <w:r>
+        <w:rPr>
+          <w:rFonts w:ascii="Times New Roman" w:hAnsi="Times New Roman" w:eastAsia="Times New Roman"/>
+          <w:b w:val="0"/>
+          <w:i w:val="0"/>
+          <w:sz w:val="24"/>
+        </w:rPr>
+        <w:t>En producción cloud se propone colocar un API Gateway como capa de entrada de la API REST, delante del Application Load Balancer (ALB). El gateway no reemplaza al balanceador: complementa su función. Mientras el ALB distribuye tráfico entre instancias del backend en ECS, el API Gateway centraliza el gobierno de la API pública.</w:t>
+      </w:r>
+    </w:p>
+    <w:p>
+      <w:pPr>
+        <w:spacing w:line="480" w:lineRule="auto" w:after="0" w:before="0"/>
+        <w:jc w:val="both"/>
+      </w:pPr>
+      <w:r>
+        <w:rPr>
+          <w:rFonts w:ascii="Times New Roman" w:hAnsi="Times New Roman" w:eastAsia="Times New Roman"/>
+          <w:b w:val="0"/>
+          <w:i w:val="0"/>
+          <w:sz w:val="24"/>
+        </w:rPr>
+        <w:t>Flujo de una petición API: Cliente → Route 53 → API Gateway → ALB → ECS (Spring Boot) → RDS. Flujo del portal web: Cliente → CloudFront/S3 (React estático); las llamadas a /accounts se enrutan hacia el API Gateway.</w:t>
+      </w:r>
+    </w:p>
+    <w:p>
+      <w:pPr>
+        <w:pStyle w:val="ListBullet"/>
+        <w:spacing w:line="480" w:lineRule="auto" w:after="0"/>
+      </w:pPr>
+      <w:r>
+        <w:rPr>
+          <w:rFonts w:ascii="Times New Roman" w:hAnsi="Times New Roman" w:eastAsia="Times New Roman"/>
+          <w:b w:val="0"/>
+          <w:i w:val="0"/>
+          <w:sz w:val="24"/>
+        </w:rPr>
+        <w:t>API Gateway: autenticación, rate limiting, CORS, versionado y punto único de entrada (/accounts).</w:t>
+      </w:r>
+    </w:p>
+    <w:p>
+      <w:pPr>
+        <w:pStyle w:val="ListBullet"/>
+        <w:spacing w:line="480" w:lineRule="auto" w:after="0"/>
+      </w:pPr>
+      <w:r>
+        <w:rPr>
+          <w:rFonts w:ascii="Times New Roman" w:hAnsi="Times New Roman" w:eastAsia="Times New Roman"/>
+          <w:b w:val="0"/>
+          <w:i w:val="0"/>
+          <w:sz w:val="24"/>
+        </w:rPr>
+        <w:t>ALB: balanceo de carga y health checks entre contenedores del backend.</w:t>
+      </w:r>
+    </w:p>
+    <w:p>
+      <w:pPr>
+        <w:pStyle w:val="ListBullet"/>
+        <w:spacing w:line="480" w:lineRule="auto" w:after="0"/>
+      </w:pPr>
+      <w:r>
+        <w:rPr>
+          <w:rFonts w:ascii="Times New Roman" w:hAnsi="Times New Roman" w:eastAsia="Times New Roman"/>
+          <w:b w:val="0"/>
+          <w:i w:val="0"/>
+          <w:sz w:val="24"/>
+        </w:rPr>
+        <w:t>ECS: ejecución del microservicio Spring Boot.</w:t>
+      </w:r>
+    </w:p>
+    <w:p>
+      <w:pPr>
+        <w:pStyle w:val="ListBullet"/>
+        <w:spacing w:line="480" w:lineRule="auto" w:after="0"/>
+      </w:pPr>
+      <w:r>
+        <w:rPr>
+          <w:rFonts w:ascii="Times New Roman" w:hAnsi="Times New Roman" w:eastAsia="Times New Roman"/>
+          <w:b w:val="0"/>
+          <w:i w:val="0"/>
+          <w:sz w:val="24"/>
+        </w:rPr>
+        <w:t>RDS: persistencia PostgreSQL en Multi-AZ.</w:t>
+      </w:r>
+    </w:p>
+    <w:p>
+      <w:pPr>
+        <w:pStyle w:val="ListBullet"/>
+        <w:spacing w:line="480" w:lineRule="auto" w:after="0"/>
+      </w:pPr>
+      <w:r>
+        <w:rPr>
+          <w:rFonts w:ascii="Times New Roman" w:hAnsi="Times New Roman" w:eastAsia="Times New Roman"/>
+          <w:b w:val="0"/>
+          <w:i w:val="0"/>
+          <w:sz w:val="24"/>
+        </w:rPr>
+        <w:t>CloudFront + S3: distribución del frontend React compilado.</w:t>
       </w:r>
     </w:p>
     <w:p>
@@ -1466,6 +1587,21 @@
           <w:sz w:val="24"/>
         </w:rPr>
         <w:t>Docker Inc. (2024). Docker documentation. https://docs.docker.com/</w:t>
+      </w:r>
+    </w:p>
+    <w:p>
+      <w:pPr>
+        <w:spacing w:line="480" w:lineRule="auto"/>
+        <w:ind w:left="720" w:hanging="720"/>
+      </w:pPr>
+      <w:r>
+        <w:rPr>
+          <w:rFonts w:ascii="Times New Roman" w:hAnsi="Times New Roman" w:eastAsia="Times New Roman"/>
+          <w:b w:val="0"/>
+          <w:i w:val="0"/>
+          <w:sz w:val="24"/>
+        </w:rPr>
+        <w:t>Amazon Web Services. (2024). Amazon API Gateway developer guide. https://docs.aws.amazon.com/apigateway/</w:t>
       </w:r>
     </w:p>
     <w:p>

</xml_diff>